<commit_message>
Proposal Packet: reword the 3 flagged Article 31 donor-facing passages
Per Mark's go-ahead. "$2,500 funds a scholarly reviewer" and "$3,500
sponsors an entire world...its scholarly review" now name the Year 2
timing explicitly rather than implying near-term delivery. The Academic
validation section's opening now states the Year 2 placement before the
cost model, and "we budget $X per reviewer" (active framing) becomes
"the eventual cost runs $X" (future framing).

Co-Authored-By: Claude Sonnet 5 <noreply@anthropic.com>
Claude-Session: https://claude.ai/code/session_01NSCNhBmXmSffqK1fiMBL7f
</commit_message>
<xml_diff>
--- a/Ministry/Funding/CiC_Ministry_Proposal_Packet_V0_1_DRAFT.docx
+++ b/Ministry/Funding/CiC_Ministry_Proposal_Packet_V0_1_DRAFT.docx
@@ -4002,7 +4002,7 @@
           <w:sz w:val="21"/>
           <w:szCs w:val="21"/>
         </w:rPr>
-        <w:t xml:space="preserve">A unique scholarly review of each world would cost roughly $2,000–3,500 per world at formal consulting rates — over $20,000 across nine worlds, which this project cannot responsibly spend at prototype stage. The plan instead: </w:t>
+        <w:t xml:space="preserve">Article 31 external scholarly review is a Year 2 goal on the project's 5-year timeline, not a prototype-stage activity — the honest cost of doing it right doesn't fit the current budget. A unique scholarly review of each world would cost roughly $2,000–3,500 per world at formal consulting rates — over $20,000 across nine worlds, which this project cannot responsibly spend at prototype stage. The eventual plan: </w:t>
       </w:r>
       <w:r>
         <w:rPr>
@@ -4020,7 +4020,7 @@
           <w:sz w:val="21"/>
           <w:szCs w:val="21"/>
         </w:rPr>
-        <w:t xml:space="preserve"> — the construction methodology, the governing constitution, and sampled depth across all live worlds — approximately 25–40 hours of work. Published norms for external academic program review run $500–2,000 for 20–30 hours; because this asks for more depth, we budget </w:t>
+        <w:t xml:space="preserve"> — the construction methodology, the governing constitution, and sampled depth across all live worlds — approximately 25–40 hours of work. Published norms for external academic program review run $500–2,000 for 20–30 hours; because this asks for more depth, the eventual cost runs </w:t>
       </w:r>
       <w:r>
         <w:rPr>
@@ -7259,7 +7259,7 @@
           <w:sz w:val="21"/>
           <w:szCs w:val="21"/>
         </w:rPr>
-        <w:t xml:space="preserve">$2,500 funds a scholarly reviewer — the credibility of the whole library.</w:t>
+        <w:t xml:space="preserve">$2,500 funds a scholarly reviewer for the Year 2 Article 31 review — the credibility of the whole library.</w:t>
       </w:r>
     </w:p>
     <w:p>
@@ -7287,7 +7287,7 @@
           <w:sz w:val="21"/>
           <w:szCs w:val="21"/>
         </w:rPr>
-        <w:t xml:space="preserve"> — its construction and its scholarly review — with recognition in that world's own documentation. A church can put its name on the Desert Fathers.</w:t>
+        <w:t xml:space="preserve"> — its construction now, with recognition in that world's own documentation; its scholarly review follows in Year 2, per Article 31. A church can put its name on the Desert Fathers.</w:t>
       </w:r>
     </w:p>
     <w:p>

</xml_diff>